<commit_message>
UX improvements: mobile drawer, functional search, help page, deactivate/activate buttons, BAC class grouping, upgrade CTA with payment logos, softer dark mode, fix risk seed (now computed), missing grade red borders
</commit_message>
<xml_diff>
--- a/MEMOIRE_PFE.docx
+++ b/MEMOIRE_PFE.docx
@@ -1506,6 +1506,12 @@
             <w:insideH w:val="none" w:color="auto" w:sz="0" w:space="0"/>
             <w:insideV w:val="none" w:color="auto" w:sz="0" w:space="0"/>
           </w:tblBorders>
+          <w:tblCellMar>
+            <w:top w:w="80" w:type="dxa"/>
+            <w:left w:w="160" w:type="dxa"/>
+            <w:bottom w:w="80" w:type="dxa"/>
+            <w:right w:w="160" w:type="dxa"/>
+          </w:tblCellMar>
         </w:tblPrEx>
         <w:trPr>
           <w:cantSplit/>
@@ -1989,6 +1995,12 @@
             <w:insideH w:val="none" w:color="auto" w:sz="0" w:space="0"/>
             <w:insideV w:val="none" w:color="auto" w:sz="0" w:space="0"/>
           </w:tblBorders>
+          <w:tblCellMar>
+            <w:top w:w="80" w:type="dxa"/>
+            <w:left w:w="160" w:type="dxa"/>
+            <w:bottom w:w="80" w:type="dxa"/>
+            <w:right w:w="160" w:type="dxa"/>
+          </w:tblCellMar>
         </w:tblPrEx>
         <w:trPr>
           <w:cantSplit/>
@@ -2826,12 +2838,6 @@
             <w:insideH w:val="none" w:color="auto" w:sz="0" w:space="0"/>
             <w:insideV w:val="none" w:color="auto" w:sz="0" w:space="0"/>
           </w:tblBorders>
-          <w:tblCellMar>
-            <w:top w:w="80" w:type="dxa"/>
-            <w:left w:w="160" w:type="dxa"/>
-            <w:bottom w:w="80" w:type="dxa"/>
-            <w:right w:w="160" w:type="dxa"/>
-          </w:tblCellMar>
         </w:tblPrEx>
         <w:trPr>
           <w:cantSplit/>
@@ -3295,12 +3301,6 @@
             <w:insideH w:val="none" w:color="auto" w:sz="0" w:space="0"/>
             <w:insideV w:val="none" w:color="auto" w:sz="0" w:space="0"/>
           </w:tblBorders>
-          <w:tblCellMar>
-            <w:top w:w="80" w:type="dxa"/>
-            <w:left w:w="160" w:type="dxa"/>
-            <w:bottom w:w="80" w:type="dxa"/>
-            <w:right w:w="160" w:type="dxa"/>
-          </w:tblCellMar>
         </w:tblPrEx>
         <w:trPr>
           <w:cantSplit/>
@@ -3567,10 +3567,7 @@
         </w:tc>
       </w:tr>
     </w:tbl>
-    <w:p>
-      <w:bookmarkStart w:id="0" w:name="_GoBack"/>
-      <w:bookmarkEnd w:id="0"/>
-    </w:p>
+    <w:p/>
     <w:p>
       <w:pPr>
         <w:pStyle w:val="4"/>
@@ -5934,10 +5931,23 @@
     <w:p>
       <w:pPr>
         <w:pStyle w:val="5"/>
-      </w:pPr>
-      <w:r>
-        <w:t>Table student_observations (NOUVEAU)</w:t>
-      </w:r>
+        <w:rPr>
+          <w:rFonts w:hint="default"/>
+          <w:lang w:val="en-US"/>
+        </w:rPr>
+      </w:pPr>
+      <w:r>
+        <w:t xml:space="preserve">Table student_observations </w:t>
+      </w:r>
+      <w:r>
+        <w:rPr>
+          <w:rFonts w:hint="default"/>
+          <w:lang w:val="en-US"/>
+        </w:rPr>
+        <w:t xml:space="preserve"> </w:t>
+      </w:r>
+      <w:bookmarkStart w:id="0" w:name="_GoBack"/>
+      <w:bookmarkEnd w:id="0"/>
     </w:p>
     <w:p>
       <w:r>
@@ -11324,6 +11334,12 @@
             <w:insideH w:val="none" w:color="auto" w:sz="0" w:space="0"/>
             <w:insideV w:val="none" w:color="auto" w:sz="0" w:space="0"/>
           </w:tblBorders>
+          <w:tblCellMar>
+            <w:top w:w="80" w:type="dxa"/>
+            <w:left w:w="160" w:type="dxa"/>
+            <w:bottom w:w="80" w:type="dxa"/>
+            <w:right w:w="160" w:type="dxa"/>
+          </w:tblCellMar>
         </w:tblPrEx>
         <w:trPr>
           <w:cantSplit/>

</xml_diff>